<commit_message>
docs: asegurar enlaces en documento Word principal
</commit_message>
<xml_diff>
--- a/Redes_Neuronales_III_Informe.docx
+++ b/Redes_Neuronales_III_Informe.docx
@@ -423,7 +423,7 @@
                 <w:color w:val="141414"/>
                 <w:sz w:val="20"/>
               </w:rPr>
-              <w:t>https://github.com/usuario/redes-neuronales-3-optimizacion</w:t>
+              <w:t>https://github.com/oscar2121/redes-neuronales-3</w:t>
             </w:r>
           </w:p>
         </w:tc>
@@ -474,7 +474,7 @@
                 <w:color w:val="141414"/>
                 <w:sz w:val="20"/>
               </w:rPr>
-              <w:t>https://colab.research.google.com/drive/1_deeplearning_redes3_practica</w:t>
+              <w:t>https://colab.research.google.com/github/oscar2121/redes-neuronales-3/blob/main/Redes_Neuronales_III_Practica.ipynb</w:t>
             </w:r>
           </w:p>
         </w:tc>
@@ -2001,23 +2001,27 @@
         </w:rPr>
         <w:t>El proyecto se encuentra versionado y estructurado con buenas prácticas de ingeniería de software en GitHub:</w:t>
         <w:br/>
-        <w:t>• URL Repositorio GitHub: https://github.com/usuario/redes-neuronales-3-optimizacion</w:t>
+        <w:t>• URL Repositorio GitHub: https://github.com/oscar2121/redes-neuronales-3</w:t>
         <w:br/>
-        <w:t>• Notebook Google Colab: https://colab.research.google.com/drive/1_deeplearning_redes3_practica</w:t>
+        <w:t>• Notebook Google Colab: https://colab.research.google.com/github/oscar2121/redes-neuronales-3/blob/main/Redes_Neuronales_III_Practica.ipynb</w:t>
         <w:br/>
         <w:t>• Estructura de Directorios:</w:t>
         <w:br/>
-        <w:t xml:space="preserve">    ├── README.md                          &lt;- Documentación técnica del repositorio</w:t>
+        <w:t xml:space="preserve">    ├── README.md                                       &lt;- Documentación técnica del repositorio</w:t>
         <w:br/>
-        <w:t xml:space="preserve">    ├── Redes_Neuronales_III_Practica.ipynb &lt;- Cuaderno interactivo listo para Google Colab</w:t>
+        <w:t xml:space="preserve">    ├── 01_optimizacion_y_regularizacion_pytorch.ipynb  &lt;- Cuaderno práctico en PyTorch</w:t>
         <w:br/>
-        <w:t xml:space="preserve">    ├── ejecutar_experimentos.py           &lt;- Script reproducible de entrenamiento y evaluación</w:t>
+        <w:t xml:space="preserve">    ├── 02_optimizacion_y_regularizacion_keras.ipynb    &lt;- Cuaderno práctico en TensorFlow / Keras</w:t>
         <w:br/>
-        <w:t xml:space="preserve">    ├── Redes_Neuronales_III_Informe.pdf   &lt;- Informe formal de entrega en PDF</w:t>
+        <w:t xml:space="preserve">    ├── Redes_Neuronales_III_Practica.ipynb             &lt;- Cuaderno maestro comparativo listo para Colab</w:t>
         <w:br/>
-        <w:t xml:space="preserve">    ├── Redes_Neuronales_III_Informe.docx  &lt;- Documento editable en Microsoft Word</w:t>
+        <w:t xml:space="preserve">    ├── ejecutar_experimentos.py                        &lt;- Script reproducible de entrenamiento y evaluación</w:t>
         <w:br/>
-        <w:t xml:space="preserve">    └── figuras/                           &lt;- Gráficas de curvas, distribución y matrices de confusión</w:t>
+        <w:t xml:space="preserve">    ├── Redes_Neuronales_III_Informe.pdf                &lt;- Informe formal de entrega en PDF</w:t>
+        <w:br/>
+        <w:t xml:space="preserve">    ├── Redes_Neuronales_III_Informe.docx               &lt;- Documento editable en Microsoft Word</w:t>
+        <w:br/>
+        <w:t xml:space="preserve">    └── figuras/                                        &lt;- Gráficas de curvas, distribución y matrices de confusión</w:t>
       </w:r>
     </w:p>
     <w:p>

</xml_diff>